<commit_message>
Maj cahier des charges
</commit_message>
<xml_diff>
--- a/processing/Cahier des charges - Reservation de salle.docx
+++ b/processing/Cahier des charges - Reservation de salle.docx
@@ -28,37 +28,6 @@
           <w:rtl w:val="0"/>
         </w:rPr>
         <w:t xml:space="preserve">1.Synopsis</w:t>
-      </w:r>
-    </w:p>
-    <w:p>
-      <w:pPr>
-        <w:rPr/>
-      </w:pPr>
-      <w:r>
-        <w:rPr>
-          <w:rtl w:val="0"/>
-        </w:rPr>
-        <w:t xml:space="preserve">Ici est décrit l’application, le besoin de la cible et le contexte dans lequel elle sera utilisée.</w:t>
-      </w:r>
-    </w:p>
-    <w:p>
-      <w:pPr>
-        <w:rPr/>
-      </w:pPr>
-      <w:r>
-        <w:rPr>
-          <w:rtl w:val="0"/>
-        </w:rPr>
-      </w:r>
-    </w:p>
-    <w:p>
-      <w:pPr>
-        <w:rPr/>
-      </w:pPr>
-      <w:r>
-        <w:rPr>
-          <w:rtl w:val="0"/>
-        </w:rPr>
       </w:r>
     </w:p>
     <w:p>
@@ -565,7 +534,7 @@
         <w:rPr>
           <w:rtl w:val="0"/>
         </w:rPr>
-        <w:t xml:space="preserve">Afin d' : accéder au planning et à mon espace personnel.</w:t>
+        <w:t xml:space="preserve">Afin : d’accéder au planning et à mon espace personnel.</w:t>
       </w:r>
     </w:p>
     <w:p>
@@ -1181,12 +1150,12 @@
           <wp:inline distB="114300" distT="114300" distL="114300" distR="114300">
             <wp:extent cx="6543675" cy="3633788"/>
             <wp:effectExtent b="0" l="0" r="0" t="0"/>
-            <wp:docPr id="3" name="image2.png"/>
+            <wp:docPr id="2" name="image3.png"/>
             <a:graphic>
               <a:graphicData uri="http://schemas.openxmlformats.org/drawingml/2006/picture">
                 <pic:pic>
                   <pic:nvPicPr>
-                    <pic:cNvPr id="0" name="image2.png"/>
+                    <pic:cNvPr id="0" name="image3.png"/>
                     <pic:cNvPicPr preferRelativeResize="0"/>
                   </pic:nvPicPr>
                   <pic:blipFill>
@@ -1298,7 +1267,7 @@
         <w:rPr>
           <w:rtl w:val="0"/>
         </w:rPr>
-        <w:t xml:space="preserve">             // Accueil, avec Lien vers Connexion et Calendrier si Connecté </w:t>
+        <w:t xml:space="preserve">            // Accueil, avec Lien vers Connexion OU Calendrier si Connecté </w:t>
       </w:r>
       <w:r>
         <w:rPr>
@@ -1517,7 +1486,7 @@
         <w:rPr>
           <w:rtl w:val="0"/>
         </w:rPr>
-        <w:t xml:space="preserve">ID, Name, Surname, Email, Password</w:t>
+        <w:t xml:space="preserve">ID, Name, Surname, Email, Password, Updated_at</w:t>
         <w:br w:type="textWrapping"/>
       </w:r>
     </w:p>
@@ -1531,7 +1500,7 @@
         </w:rPr>
         <w:t xml:space="preserve">inscription en base de donnée des informations relatif à la réservation de salle dans une table {RESERVATION}</w:t>
         <w:br w:type="textWrapping"/>
-        <w:t xml:space="preserve">ID, Reunion Title, Organizer, Start Date, End Date</w:t>
+        <w:t xml:space="preserve">ID, Reunion Title, Organizer, Start Date, End Date, Created_at, Updated_at</w:t>
         <w:br w:type="textWrapping"/>
       </w:r>
       <w:r>
@@ -1623,9 +1592,9 @@
         </w:rPr>
         <w:drawing>
           <wp:inline distB="114300" distT="114300" distL="114300" distR="114300">
-            <wp:extent cx="5731200" cy="1625600"/>
+            <wp:extent cx="5731200" cy="2032000"/>
             <wp:effectExtent b="0" l="0" r="0" t="0"/>
-            <wp:docPr id="2" name="image1.png"/>
+            <wp:docPr id="3" name="image1.png"/>
             <a:graphic>
               <a:graphicData uri="http://schemas.openxmlformats.org/drawingml/2006/picture">
                 <pic:pic>
@@ -1643,7 +1612,7 @@
                   <pic:spPr>
                     <a:xfrm>
                       <a:off x="0" y="0"/>
-                      <a:ext cx="5731200" cy="1625600"/>
+                      <a:ext cx="5731200" cy="2032000"/>
                     </a:xfrm>
                     <a:prstGeom prst="rect"/>
                     <a:ln/>
@@ -1681,12 +1650,12 @@
           <wp:inline distB="114300" distT="114300" distL="114300" distR="114300">
             <wp:extent cx="5731200" cy="2298700"/>
             <wp:effectExtent b="0" l="0" r="0" t="0"/>
-            <wp:docPr id="1" name="image3.png"/>
+            <wp:docPr id="1" name="image2.png"/>
             <a:graphic>
               <a:graphicData uri="http://schemas.openxmlformats.org/drawingml/2006/picture">
                 <pic:pic>
                   <pic:nvPicPr>
-                    <pic:cNvPr id="0" name="image3.png"/>
+                    <pic:cNvPr id="0" name="image2.png"/>
                     <pic:cNvPicPr preferRelativeResize="0"/>
                   </pic:nvPicPr>
                   <pic:blipFill>
@@ -2559,23 +2528,154 @@
     <w:p>
       <w:pPr>
         <w:rPr/>
-      </w:pPr>
-      <w:r>
-        <w:rPr>
-          <w:rtl w:val="0"/>
-        </w:rPr>
-      </w:r>
-    </w:p>
-    <w:p>
-      <w:pPr>
-        <w:rPr/>
-      </w:pPr>
-      <w:r>
-        <w:rPr>
-          <w:rtl w:val="0"/>
-        </w:rPr>
-        <w:br w:type="textWrapping"/>
-      </w:r>
+        <w:sectPr>
+          <w:type w:val="continuous"/>
+          <w:pgSz w:h="16834" w:w="11909" w:orient="portrait"/>
+          <w:pgMar w:bottom="1440" w:top="1440" w:left="1440" w:right="1440" w:header="720" w:footer="720"/>
+        </w:sectPr>
+      </w:pPr>
+      <w:r>
+        <w:rPr>
+          <w:rtl w:val="0"/>
+        </w:rPr>
+        <w:br w:type="textWrapping"/>
+      </w:r>
+    </w:p>
+    <w:p>
+      <w:pPr>
+        <w:rPr/>
+      </w:pPr>
+      <w:hyperlink r:id="rId21">
+        <w:r>
+          <w:rPr>
+            <w:color w:val="1155cc"/>
+            <w:u w:val="single"/>
+            <w:rtl w:val="0"/>
+          </w:rPr>
+          <w:t xml:space="preserve">http://localhost:5000/</w:t>
+        </w:r>
+      </w:hyperlink>
+      <w:r>
+        <w:rPr>
+          <w:rtl w:val="0"/>
+        </w:rPr>
+        <w:t xml:space="preserve">profil/:id</w:t>
+        <w:br w:type="textWrapping"/>
+        <w:t xml:space="preserve">(anonymisation)</w:t>
+      </w:r>
+    </w:p>
+    <w:p>
+      <w:pPr>
+        <w:rPr/>
+      </w:pPr>
+      <w:r>
+        <w:rPr>
+          <w:rtl w:val="0"/>
+        </w:rPr>
+        <w:t xml:space="preserve">Méthode Post, Code 201, Envoi : </w:t>
+      </w:r>
+    </w:p>
+    <w:p>
+      <w:pPr>
+        <w:rPr/>
+      </w:pPr>
+      <w:r>
+        <w:rPr>
+          <w:rtl w:val="0"/>
+        </w:rPr>
+        <w:t xml:space="preserve">{</w:t>
+        <w:br w:type="textWrapping"/>
+        <w:t xml:space="preserve">“name” : “anonymisé”, </w:t>
+        <w:br w:type="textWrapping"/>
+        <w:t xml:space="preserve">“surname” : “anonymisé”,</w:t>
+        <w:br w:type="textWrapping"/>
+        <w:t xml:space="preserve">“email” : “anonymisé”</w:t>
+      </w:r>
+    </w:p>
+    <w:p>
+      <w:pPr>
+        <w:rPr/>
+      </w:pPr>
+      <w:r>
+        <w:rPr>
+          <w:rtl w:val="0"/>
+        </w:rPr>
+        <w:t xml:space="preserve">}</w:t>
+      </w:r>
+    </w:p>
+    <w:p>
+      <w:pPr>
+        <w:rPr/>
+      </w:pPr>
+      <w:r>
+        <w:rPr>
+          <w:rtl w:val="0"/>
+        </w:rPr>
+        <w:t xml:space="preserve">Méthode Post, Code 201, Envoi : </w:t>
+      </w:r>
+    </w:p>
+    <w:p>
+      <w:pPr>
+        <w:rPr/>
+      </w:pPr>
+      <w:r>
+        <w:rPr>
+          <w:rtl w:val="0"/>
+        </w:rPr>
+        <w:t xml:space="preserve">{</w:t>
+        <w:br w:type="textWrapping"/>
+        <w:t xml:space="preserve">“name” : “anonymisé”, </w:t>
+        <w:br w:type="textWrapping"/>
+        <w:t xml:space="preserve">“surname” : “anonymisé”,</w:t>
+        <w:br w:type="textWrapping"/>
+        <w:t xml:space="preserve">“email” : “anonymisé”</w:t>
+      </w:r>
+    </w:p>
+    <w:p>
+      <w:pPr>
+        <w:rPr/>
+        <w:sectPr>
+          <w:type w:val="continuous"/>
+          <w:pgSz w:h="16834" w:w="11909" w:orient="portrait"/>
+          <w:pgMar w:bottom="1440" w:top="1440" w:left="1440" w:right="1440" w:header="720" w:footer="720"/>
+          <w:cols w:equalWidth="0" w:num="2">
+            <w:col w:space="720" w:w="4152.74"/>
+            <w:col w:space="0" w:w="4152.74"/>
+          </w:cols>
+        </w:sectPr>
+      </w:pPr>
+      <w:r>
+        <w:rPr>
+          <w:rtl w:val="0"/>
+        </w:rPr>
+        <w:t xml:space="preserve">}</w:t>
+      </w:r>
+    </w:p>
+    <w:p>
+      <w:pPr>
+        <w:rPr/>
+      </w:pPr>
+      <w:r>
+        <w:rPr>
+          <w:rtl w:val="0"/>
+        </w:rPr>
+      </w:r>
+    </w:p>
+    <w:p>
+      <w:pPr>
+        <w:rPr/>
+      </w:pPr>
+      <w:r>
+        <w:rPr>
+          <w:rtl w:val="0"/>
+        </w:rPr>
+        <w:br w:type="textWrapping"/>
+      </w:r>
+    </w:p>
+    <w:p>
+      <w:pPr>
+        <w:rPr/>
+      </w:pPr>
       <w:r>
         <w:rPr>
           <w:rtl w:val="0"/>
@@ -2686,7 +2786,7 @@
       <w:pPr>
         <w:numPr>
           <w:ilvl w:val="0"/>
-          <w:numId w:val="4"/>
+          <w:numId w:val="3"/>
         </w:numPr>
         <w:ind w:left="720" w:hanging="360"/>
         <w:rPr/>
@@ -2696,208 +2796,6 @@
           <w:rtl w:val="0"/>
         </w:rPr>
         <w:t xml:space="preserve">Interdiction PII personally identifiable informations</w:t>
-      </w:r>
-    </w:p>
-    <w:p>
-      <w:pPr>
-        <w:numPr>
-          <w:ilvl w:val="0"/>
-          <w:numId w:val="4"/>
-        </w:numPr>
-        <w:ind w:left="720" w:hanging="360"/>
-        <w:rPr/>
-      </w:pPr>
-      <w:r>
-        <w:rPr>
-          <w:rtl w:val="0"/>
-        </w:rPr>
-        <w:t xml:space="preserve">Anonymisation</w:t>
-      </w:r>
-    </w:p>
-    <w:p>
-      <w:pPr>
-        <w:numPr>
-          <w:ilvl w:val="0"/>
-          <w:numId w:val="4"/>
-        </w:numPr>
-        <w:ind w:left="720" w:hanging="360"/>
-        <w:rPr/>
-      </w:pPr>
-      <w:r>
-        <w:rPr>
-          <w:rtl w:val="0"/>
-        </w:rPr>
-        <w:t xml:space="preserve">Suppression de Log de connexion sensible IP, identifiant, etc, ...</w:t>
-      </w:r>
-    </w:p>
-    <w:p>
-      <w:pPr>
-        <w:rPr/>
-      </w:pPr>
-      <w:r>
-        <w:rPr>
-          <w:rtl w:val="0"/>
-        </w:rPr>
-      </w:r>
-    </w:p>
-    <w:p>
-      <w:pPr>
-        <w:pStyle w:val="Heading3"/>
-        <w:rPr/>
-      </w:pPr>
-      <w:bookmarkStart w:colFirst="0" w:colLast="0" w:name="_heading=h.45uujm195uck" w:id="20"/>
-      <w:bookmarkEnd w:id="20"/>
-      <w:r>
-        <w:rPr>
-          <w:rtl w:val="0"/>
-        </w:rPr>
-        <w:t xml:space="preserve">Déploiement (devops,cicd,docker)</w:t>
-      </w:r>
-    </w:p>
-    <w:p>
-      <w:pPr>
-        <w:rPr/>
-      </w:pPr>
-      <w:r>
-        <w:rPr>
-          <w:rtl w:val="0"/>
-        </w:rPr>
-        <w:t xml:space="preserve">Vercel</w:t>
-      </w:r>
-    </w:p>
-    <w:p>
-      <w:pPr>
-        <w:pStyle w:val="Heading3"/>
-        <w:rPr/>
-      </w:pPr>
-      <w:bookmarkStart w:colFirst="0" w:colLast="0" w:name="_heading=h.pv1yb6ze5kez" w:id="21"/>
-      <w:bookmarkEnd w:id="21"/>
-      <w:r>
-        <w:rPr>
-          <w:rtl w:val="0"/>
-        </w:rPr>
-        <w:t xml:space="preserve">Logging</w:t>
-      </w:r>
-    </w:p>
-    <w:p>
-      <w:pPr>
-        <w:rPr/>
-      </w:pPr>
-      <w:r>
-        <w:rPr>
-          <w:rtl w:val="0"/>
-        </w:rPr>
-        <w:t xml:space="preserve">Niveau de logging : DEBUG, INFO, WARNING, ERROR de stdout</w:t>
-      </w:r>
-    </w:p>
-    <w:p>
-      <w:pPr>
-        <w:rPr/>
-      </w:pPr>
-      <w:r>
-        <w:rPr>
-          <w:rtl w:val="0"/>
-        </w:rPr>
-        <w:t xml:space="preserve">Code d’erreur</w:t>
-      </w:r>
-    </w:p>
-    <w:p>
-      <w:pPr>
-        <w:rPr/>
-      </w:pPr>
-      <w:r>
-        <w:rPr>
-          <w:rtl w:val="0"/>
-        </w:rPr>
-        <w:t xml:space="preserve">200 : Ok = profil utilisateur récupéré, planning récupéré…</w:t>
-      </w:r>
-    </w:p>
-    <w:p>
-      <w:pPr>
-        <w:rPr/>
-      </w:pPr>
-      <w:r>
-        <w:rPr>
-          <w:rtl w:val="0"/>
-        </w:rPr>
-        <w:t xml:space="preserve">201 : Created = Compte créé avec succès, réservation effectué </w:t>
-      </w:r>
-    </w:p>
-    <w:p>
-      <w:pPr>
-        <w:rPr>
-          <w:color w:val="cccccc"/>
-          <w:highlight w:val="black"/>
-        </w:rPr>
-      </w:pPr>
-      <w:r>
-        <w:rPr>
-          <w:rtl w:val="0"/>
-        </w:rPr>
-        <w:t xml:space="preserve">401 : Unauthorized  = Token JWT invalide, créer un compte ou reconnectez-vous </w:t>
-      </w:r>
-      <w:r>
-        <w:rPr>
-          <w:rtl w:val="0"/>
-        </w:rPr>
-      </w:r>
-    </w:p>
-    <w:p>
-      <w:pPr>
-        <w:rPr/>
-      </w:pPr>
-      <w:r>
-        <w:rPr>
-          <w:rtl w:val="0"/>
-        </w:rPr>
-        <w:t xml:space="preserve">404 : Not Found = Utilisateur inexistant (profil/***)</w:t>
-      </w:r>
-    </w:p>
-    <w:p>
-      <w:pPr>
-        <w:rPr/>
-      </w:pPr>
-      <w:r>
-        <w:rPr>
-          <w:rtl w:val="0"/>
-        </w:rPr>
-        <w:t xml:space="preserve">409 : Conflict = Email déjà utilisé</w:t>
-      </w:r>
-    </w:p>
-    <w:p>
-      <w:pPr>
-        <w:rPr/>
-      </w:pPr>
-      <w:r>
-        <w:rPr>
-          <w:rtl w:val="0"/>
-        </w:rPr>
-        <w:t xml:space="preserve">500 : Server Error = Connexion à la BDD impossible </w:t>
-      </w:r>
-    </w:p>
-    <w:p>
-      <w:pPr>
-        <w:pStyle w:val="Heading3"/>
-        <w:rPr/>
-      </w:pPr>
-      <w:bookmarkStart w:colFirst="0" w:colLast="0" w:name="_heading=h.99kze1sho2l5" w:id="22"/>
-      <w:bookmarkEnd w:id="22"/>
-      <w:r>
-        <w:rPr>
-          <w:rtl w:val="0"/>
-        </w:rPr>
-        <w:t xml:space="preserve">Performance</w:t>
-      </w:r>
-    </w:p>
-    <w:p>
-      <w:pPr>
-        <w:rPr/>
-      </w:pPr>
-      <w:r>
-        <w:rPr>
-          <w:rtl w:val="0"/>
-        </w:rPr>
-        <w:t xml:space="preserve">Solutions technique et preuves :</w:t>
       </w:r>
     </w:p>
     <w:p>
@@ -2913,7 +2811,7 @@
         <w:rPr>
           <w:rtl w:val="0"/>
         </w:rPr>
-        <w:t xml:space="preserve">(apache benchmark,k6 grafana,locust, etc,...) qui permettent de grandir les performance de l’application : </w:t>
+        <w:t xml:space="preserve">Anonymisation</w:t>
       </w:r>
     </w:p>
     <w:p>
@@ -2929,116 +2827,152 @@
         <w:rPr>
           <w:rtl w:val="0"/>
         </w:rPr>
-        <w:t xml:space="preserve">Burst RPS(request per second) limite garantie,</w:t>
-      </w:r>
-    </w:p>
-    <w:p>
-      <w:pPr>
-        <w:numPr>
-          <w:ilvl w:val="0"/>
-          <w:numId w:val="3"/>
-        </w:numPr>
-        <w:ind w:left="720" w:hanging="360"/>
-        <w:rPr/>
-      </w:pPr>
-      <w:r>
-        <w:rPr>
-          <w:rtl w:val="0"/>
-        </w:rPr>
-        <w:t xml:space="preserve"> latence des requêtes en ms. </w:t>
-      </w:r>
-    </w:p>
-    <w:p>
-      <w:pPr>
-        <w:numPr>
-          <w:ilvl w:val="0"/>
-          <w:numId w:val="3"/>
-        </w:numPr>
-        <w:ind w:left="720" w:hanging="360"/>
-        <w:rPr/>
-      </w:pPr>
-      <w:r>
-        <w:rPr>
-          <w:rtl w:val="0"/>
-        </w:rPr>
-        <w:t xml:space="preserve">temps de traitement etc …</w:t>
-      </w:r>
-    </w:p>
-    <w:p>
-      <w:pPr>
-        <w:rPr/>
-      </w:pPr>
-      <w:r>
-        <w:rPr>
-          <w:rtl w:val="0"/>
-        </w:rPr>
-      </w:r>
-    </w:p>
-    <w:p>
-      <w:pPr>
-        <w:rPr>
-          <w:color w:val="434343"/>
-          <w:sz w:val="28"/>
-          <w:szCs w:val="28"/>
-        </w:rPr>
-      </w:pPr>
-      <w:r>
-        <w:rPr>
-          <w:color w:val="434343"/>
-          <w:sz w:val="28"/>
-          <w:szCs w:val="28"/>
-          <w:rtl w:val="0"/>
-        </w:rPr>
-        <w:t xml:space="preserve">…</w:t>
-      </w:r>
-    </w:p>
-    <w:p>
-      <w:pPr>
-        <w:rPr>
-          <w:color w:val="434343"/>
-          <w:sz w:val="28"/>
-          <w:szCs w:val="28"/>
-        </w:rPr>
-      </w:pPr>
-      <w:r>
-        <w:rPr>
-          <w:rtl w:val="0"/>
-        </w:rPr>
-      </w:r>
-    </w:p>
-    <w:p>
-      <w:pPr>
-        <w:pStyle w:val="Heading1"/>
-        <w:rPr/>
-      </w:pPr>
-      <w:bookmarkStart w:colFirst="0" w:colLast="0" w:name="_heading=h.tnipk2t1wntz" w:id="23"/>
-      <w:bookmarkEnd w:id="23"/>
-      <w:r>
-        <w:rPr>
-          <w:rtl w:val="0"/>
-        </w:rPr>
-        <w:t xml:space="preserve">3. Annexe des diagrammes </w:t>
-      </w:r>
-    </w:p>
-    <w:p>
-      <w:pPr>
-        <w:rPr/>
-      </w:pPr>
-      <w:r>
-        <w:rPr>
-          <w:rtl w:val="0"/>
-        </w:rPr>
-        <w:t xml:space="preserve">Tous les diagrammes </w:t>
-      </w:r>
-    </w:p>
-    <w:p>
-      <w:pPr>
-        <w:rPr/>
-      </w:pPr>
-      <w:r>
-        <w:rPr>
-          <w:rtl w:val="0"/>
-        </w:rPr>
+        <w:t xml:space="preserve">Suppression de Log de connexion sensible IP, identifiant, etc, ...</w:t>
+      </w:r>
+    </w:p>
+    <w:p>
+      <w:pPr>
+        <w:rPr/>
+      </w:pPr>
+      <w:r>
+        <w:rPr>
+          <w:rtl w:val="0"/>
+        </w:rPr>
+      </w:r>
+    </w:p>
+    <w:p>
+      <w:pPr>
+        <w:pStyle w:val="Heading3"/>
+        <w:rPr/>
+      </w:pPr>
+      <w:bookmarkStart w:colFirst="0" w:colLast="0" w:name="_heading=h.45uujm195uck" w:id="20"/>
+      <w:bookmarkEnd w:id="20"/>
+      <w:r>
+        <w:rPr>
+          <w:rtl w:val="0"/>
+        </w:rPr>
+        <w:t xml:space="preserve">Déploiement (devops,cicd,docker)</w:t>
+      </w:r>
+    </w:p>
+    <w:p>
+      <w:pPr>
+        <w:rPr/>
+      </w:pPr>
+      <w:r>
+        <w:rPr>
+          <w:rtl w:val="0"/>
+        </w:rPr>
+        <w:t xml:space="preserve">Vercel</w:t>
+      </w:r>
+    </w:p>
+    <w:p>
+      <w:pPr>
+        <w:pStyle w:val="Heading3"/>
+        <w:rPr/>
+      </w:pPr>
+      <w:bookmarkStart w:colFirst="0" w:colLast="0" w:name="_heading=h.pv1yb6ze5kez" w:id="21"/>
+      <w:bookmarkEnd w:id="21"/>
+      <w:r>
+        <w:rPr>
+          <w:rtl w:val="0"/>
+        </w:rPr>
+        <w:t xml:space="preserve">Logging</w:t>
+      </w:r>
+    </w:p>
+    <w:p>
+      <w:pPr>
+        <w:rPr/>
+      </w:pPr>
+      <w:r>
+        <w:rPr>
+          <w:rtl w:val="0"/>
+        </w:rPr>
+        <w:t xml:space="preserve">Niveau de logging : DEBUG, INFO, WARNING, ERROR de stdout</w:t>
+      </w:r>
+    </w:p>
+    <w:p>
+      <w:pPr>
+        <w:rPr/>
+      </w:pPr>
+      <w:r>
+        <w:rPr>
+          <w:rtl w:val="0"/>
+        </w:rPr>
+        <w:t xml:space="preserve">Code d’erreur</w:t>
+      </w:r>
+    </w:p>
+    <w:p>
+      <w:pPr>
+        <w:rPr/>
+      </w:pPr>
+      <w:r>
+        <w:rPr>
+          <w:rtl w:val="0"/>
+        </w:rPr>
+        <w:t xml:space="preserve">200 : Ok = profil utilisateur récupéré, planning récupéré…</w:t>
+      </w:r>
+    </w:p>
+    <w:p>
+      <w:pPr>
+        <w:rPr/>
+      </w:pPr>
+      <w:r>
+        <w:rPr>
+          <w:rtl w:val="0"/>
+        </w:rPr>
+        <w:t xml:space="preserve">201 : Created = Compte créé avec succès, réservation effectué </w:t>
+      </w:r>
+    </w:p>
+    <w:p>
+      <w:pPr>
+        <w:rPr>
+          <w:color w:val="cccccc"/>
+          <w:highlight w:val="black"/>
+        </w:rPr>
+      </w:pPr>
+      <w:r>
+        <w:rPr>
+          <w:rtl w:val="0"/>
+        </w:rPr>
+        <w:t xml:space="preserve">401 : Unauthorized  = Token JWT invalide, créer un compte ou reconnectez-vous </w:t>
+      </w:r>
+      <w:r>
+        <w:rPr>
+          <w:rtl w:val="0"/>
+        </w:rPr>
+      </w:r>
+    </w:p>
+    <w:p>
+      <w:pPr>
+        <w:rPr/>
+      </w:pPr>
+      <w:r>
+        <w:rPr>
+          <w:rtl w:val="0"/>
+        </w:rPr>
+        <w:t xml:space="preserve">404 : Not Found = Utilisateur inexistant (profil/***)</w:t>
+      </w:r>
+    </w:p>
+    <w:p>
+      <w:pPr>
+        <w:rPr/>
+      </w:pPr>
+      <w:r>
+        <w:rPr>
+          <w:rtl w:val="0"/>
+        </w:rPr>
+        <w:t xml:space="preserve">409 : Conflict = Email déjà utilisé</w:t>
+      </w:r>
+    </w:p>
+    <w:p>
+      <w:pPr>
+        <w:rPr/>
+      </w:pPr>
+      <w:r>
+        <w:rPr>
+          <w:rtl w:val="0"/>
+        </w:rPr>
+        <w:t xml:space="preserve">500 : Server Error = Connexion à la BDD impossible </w:t>
       </w:r>
     </w:p>
     <w:sectPr>
@@ -3382,116 +3316,6 @@
       </w:rPr>
     </w:lvl>
   </w:abstractNum>
-  <w:abstractNum w:abstractNumId="4">
-    <w:lvl w:ilvl="0">
-      <w:start w:val="1"/>
-      <w:numFmt w:val="bullet"/>
-      <w:lvlText w:val="●"/>
-      <w:lvlJc w:val="left"/>
-      <w:pPr>
-        <w:ind w:left="720" w:hanging="360"/>
-      </w:pPr>
-      <w:rPr>
-        <w:u w:val="none"/>
-      </w:rPr>
-    </w:lvl>
-    <w:lvl w:ilvl="1">
-      <w:start w:val="1"/>
-      <w:numFmt w:val="bullet"/>
-      <w:lvlText w:val="○"/>
-      <w:lvlJc w:val="left"/>
-      <w:pPr>
-        <w:ind w:left="1440" w:hanging="360"/>
-      </w:pPr>
-      <w:rPr>
-        <w:u w:val="none"/>
-      </w:rPr>
-    </w:lvl>
-    <w:lvl w:ilvl="2">
-      <w:start w:val="1"/>
-      <w:numFmt w:val="bullet"/>
-      <w:lvlText w:val="■"/>
-      <w:lvlJc w:val="left"/>
-      <w:pPr>
-        <w:ind w:left="2160" w:hanging="360"/>
-      </w:pPr>
-      <w:rPr>
-        <w:u w:val="none"/>
-      </w:rPr>
-    </w:lvl>
-    <w:lvl w:ilvl="3">
-      <w:start w:val="1"/>
-      <w:numFmt w:val="bullet"/>
-      <w:lvlText w:val="●"/>
-      <w:lvlJc w:val="left"/>
-      <w:pPr>
-        <w:ind w:left="2880" w:hanging="360"/>
-      </w:pPr>
-      <w:rPr>
-        <w:u w:val="none"/>
-      </w:rPr>
-    </w:lvl>
-    <w:lvl w:ilvl="4">
-      <w:start w:val="1"/>
-      <w:numFmt w:val="bullet"/>
-      <w:lvlText w:val="○"/>
-      <w:lvlJc w:val="left"/>
-      <w:pPr>
-        <w:ind w:left="3600" w:hanging="360"/>
-      </w:pPr>
-      <w:rPr>
-        <w:u w:val="none"/>
-      </w:rPr>
-    </w:lvl>
-    <w:lvl w:ilvl="5">
-      <w:start w:val="1"/>
-      <w:numFmt w:val="bullet"/>
-      <w:lvlText w:val="■"/>
-      <w:lvlJc w:val="left"/>
-      <w:pPr>
-        <w:ind w:left="4320" w:hanging="360"/>
-      </w:pPr>
-      <w:rPr>
-        <w:u w:val="none"/>
-      </w:rPr>
-    </w:lvl>
-    <w:lvl w:ilvl="6">
-      <w:start w:val="1"/>
-      <w:numFmt w:val="bullet"/>
-      <w:lvlText w:val="●"/>
-      <w:lvlJc w:val="left"/>
-      <w:pPr>
-        <w:ind w:left="5040" w:hanging="360"/>
-      </w:pPr>
-      <w:rPr>
-        <w:u w:val="none"/>
-      </w:rPr>
-    </w:lvl>
-    <w:lvl w:ilvl="7">
-      <w:start w:val="1"/>
-      <w:numFmt w:val="bullet"/>
-      <w:lvlText w:val="○"/>
-      <w:lvlJc w:val="left"/>
-      <w:pPr>
-        <w:ind w:left="5760" w:hanging="360"/>
-      </w:pPr>
-      <w:rPr>
-        <w:u w:val="none"/>
-      </w:rPr>
-    </w:lvl>
-    <w:lvl w:ilvl="8">
-      <w:start w:val="1"/>
-      <w:numFmt w:val="bullet"/>
-      <w:lvlText w:val="■"/>
-      <w:lvlJc w:val="left"/>
-      <w:pPr>
-        <w:ind w:left="6480" w:hanging="360"/>
-      </w:pPr>
-      <w:rPr>
-        <w:u w:val="none"/>
-      </w:rPr>
-    </w:lvl>
-  </w:abstractNum>
   <w:num w:numId="1">
     <w:abstractNumId w:val="1"/>
   </w:num>
@@ -3500,9 +3324,6 @@
   </w:num>
   <w:num w:numId="3">
     <w:abstractNumId w:val="3"/>
-  </w:num>
-  <w:num w:numId="4">
-    <w:abstractNumId w:val="4"/>
   </w:num>
 </w:numbering>
 </file>
@@ -4011,7 +3832,7 @@
 
 <file path=customXML/item1.xml><?xml version="1.0" encoding="utf-8"?>
 <go:gDocsCustomXmlDataStorage xmlns:go="http://customooxmlschemas.google.com/" xmlns:r="http://schemas.openxmlformats.org/officeDocument/2006/relationships" uri="GoogleDocsCustomDataVersion2">
-  <go:docsCustomData xmlns:go="http://customooxmlschemas.google.com/" roundtripDataSignature="AMtx7mibUYTMgdzUCfcqRHCo0nthktV5sQ==">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</go:docsCustomData>
+  <go:docsCustomData xmlns:go="http://customooxmlschemas.google.com/" roundtripDataSignature="AMtx7mgcnKKsu0BggbBb5NqHoRHoQqn6Uw==">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</go:docsCustomData>
 </go:gDocsCustomXmlDataStorage>
 </file>
 

</xml_diff>